<commit_message>
fix: error variable not defined
</commit_message>
<xml_diff>
--- a/templates/template_preventif_mini.docx
+++ b/templates/template_preventif_mini.docx
@@ -184,7 +184,24 @@
           <w:sz w:val="24"/>
           <w:szCs w:val="24"/>
         </w:rPr>
-        <w:t xml:space="preserve"> kami yang bertanda tangan di bawah ini menyatakan bersama bahwa telah dilakukan pekerjaan seperti yang tercantum, di lokasi </w:t>
+        <w:t xml:space="preserve"> kami yang bertanda tangan di bawah ini menyatakan bersama bahwa telah dilakukan pekerjaan seperti yang tercantum, di </w:t>
+      </w:r>
+      <w:r>
+        <w:rPr>
+          <w:rFonts w:ascii="Basic" w:eastAsia="Basic" w:hAnsi="Basic" w:cs="Basic"/>
+          <w:sz w:val="24"/>
+          <w:szCs w:val="24"/>
+          <w:lang w:val="en-US"/>
+        </w:rPr>
+        <w:t>PT</w:t>
+      </w:r>
+      <w:r>
+        <w:rPr>
+          <w:rFonts w:ascii="Basic" w:eastAsia="Basic" w:hAnsi="Basic" w:cs="Basic"/>
+          <w:sz w:val="24"/>
+          <w:szCs w:val="24"/>
+        </w:rPr>
+        <w:t xml:space="preserve"> </w:t>
       </w:r>
       <w:r>
         <w:rPr>
@@ -202,7 +219,7 @@
           <w:szCs w:val="24"/>
           <w:lang w:val="en-US"/>
         </w:rPr>
-        <w:t>alamat</w:t>
+        <w:t>site</w:t>
       </w:r>
       <w:r>
         <w:rPr>
@@ -2102,7 +2119,7 @@
         <v:shape id="4098" o:spid="_x0000_i1026" type="#_x0000_t75" style="width:450.8pt;height:6.9pt;visibility:visible;mso-wrap-distance-left:0;mso-wrap-distance-right:0">
           <v:imagedata r:id="rId1" o:title="" embosscolor="white"/>
         </v:shape>
-        <o:OLEObject Type="Embed" ProgID="CorelDraw.Graphic.16" ShapeID="4098" DrawAspect="Content" ObjectID="_1850980377" r:id="rId2"/>
+        <o:OLEObject Type="Embed" ProgID="CorelDraw.Graphic.16" ShapeID="4098" DrawAspect="Content" ObjectID="_1850990514" r:id="rId2"/>
       </w:object>
     </w:r>
     <w:r>
@@ -2444,7 +2461,7 @@
           <v:imagedata r:id="rId1" o:title="" embosscolor="white"/>
           <w10:wrap anchorx="margin"/>
         </v:shape>
-        <o:OLEObject Type="Embed" ProgID="CorelDraw.Graphic.16" ShapeID="4097" DrawAspect="Content" ObjectID="_1850980378" r:id="rId2"/>
+        <o:OLEObject Type="Embed" ProgID="CorelDraw.Graphic.16" ShapeID="4097" DrawAspect="Content" ObjectID="_1850990515" r:id="rId2"/>
       </w:object>
     </w:r>
   </w:p>

</xml_diff>